<commit_message>
Guides and figures in black and grey only (no blue)
</commit_message>
<xml_diff>
--- a/paper/Research_Paper_Explained.docx
+++ b/paper/Research_Paper_Explained.docx
@@ -9,7 +9,7 @@
       <w:r>
         <w:rPr>
           <w:b/>
-          <w:color w:val="1D4ED8"/>
+          <w:color w:val="000000"/>
           <w:sz w:val="48"/>
         </w:rPr>
         <w:t>Our Research Paper Explained</w:t>
@@ -21,7 +21,7 @@
       </w:pPr>
       <w:r>
         <w:rPr>
-          <w:color w:val="1E293B"/>
+          <w:color w:val="1A1A1A"/>
           <w:sz w:val="26"/>
         </w:rPr>
         <w:t>Every section, word, symbol, table, figure and number of the paper, in simple language</w:t>
@@ -33,7 +33,7 @@
       </w:pPr>
       <w:r>
         <w:rPr>
-          <w:color w:val="475569"/>
+          <w:color w:val="4D4D4D"/>
           <w:sz w:val="21"/>
         </w:rPr>
         <w:t>Mihir Bhati (24BCE5341)  ·  Ahana Sharan (24BCE5334)  ·  Guide: Vijayaprabakaran K</w:t>
@@ -45,7 +45,7 @@
       </w:pPr>
       <w:r>
         <w:rPr>
-          <w:color w:val="475569"/>
+          <w:color w:val="4D4D4D"/>
           <w:sz w:val="21"/>
         </w:rPr>
         <w:t>VIT Chennai  ·  Companion to paper/main.tex (8 pages, IEEE conference format)</w:t>
@@ -64,7 +64,7 @@
         <w:tc>
           <w:tcPr>
             <w:tcW w:type="dxa" w:w="9411"/>
-            <w:shd w:val="clear" w:color="auto" w:fill="EFF6FF"/>
+            <w:shd w:val="clear" w:color="auto" w:fill="F2F2F2"/>
           </w:tcPr>
           <w:p>
             <w:r/>
@@ -311,7 +311,7 @@
         <w:tc>
           <w:tcPr>
             <w:tcW w:type="dxa" w:w="9411"/>
-            <w:shd w:val="clear" w:color="auto" w:fill="EFF6FF"/>
+            <w:shd w:val="clear" w:color="auto" w:fill="F2F2F2"/>
           </w:tcPr>
           <w:p>
             <w:r/>
@@ -401,7 +401,7 @@
         <w:tc>
           <w:tcPr>
             <w:tcW w:type="dxa" w:w="1871"/>
-            <w:shd w:val="clear" w:color="auto" w:fill="DBEAFE"/>
+            <w:shd w:val="clear" w:color="auto" w:fill="E5E5E5"/>
           </w:tcPr>
           <w:p>
             <w:r/>
@@ -417,7 +417,7 @@
         <w:tc>
           <w:tcPr>
             <w:tcW w:type="dxa" w:w="3969"/>
-            <w:shd w:val="clear" w:color="auto" w:fill="DBEAFE"/>
+            <w:shd w:val="clear" w:color="auto" w:fill="E5E5E5"/>
           </w:tcPr>
           <w:p>
             <w:r/>
@@ -433,7 +433,7 @@
         <w:tc>
           <w:tcPr>
             <w:tcW w:type="dxa" w:w="3572"/>
-            <w:shd w:val="clear" w:color="auto" w:fill="DBEAFE"/>
+            <w:shd w:val="clear" w:color="auto" w:fill="E5E5E5"/>
           </w:tcPr>
           <w:p>
             <w:r/>
@@ -1176,7 +1176,7 @@
         <w:tc>
           <w:tcPr>
             <w:tcW w:type="dxa" w:w="2268"/>
-            <w:shd w:val="clear" w:color="auto" w:fill="DBEAFE"/>
+            <w:shd w:val="clear" w:color="auto" w:fill="E5E5E5"/>
           </w:tcPr>
           <w:p>
             <w:r/>
@@ -1192,7 +1192,7 @@
         <w:tc>
           <w:tcPr>
             <w:tcW w:type="dxa" w:w="7143"/>
-            <w:shd w:val="clear" w:color="auto" w:fill="DBEAFE"/>
+            <w:shd w:val="clear" w:color="auto" w:fill="E5E5E5"/>
           </w:tcPr>
           <w:p>
             <w:r/>
@@ -1711,7 +1711,7 @@
         <w:tc>
           <w:tcPr>
             <w:tcW w:type="dxa" w:w="2268"/>
-            <w:shd w:val="clear" w:color="auto" w:fill="DBEAFE"/>
+            <w:shd w:val="clear" w:color="auto" w:fill="E5E5E5"/>
           </w:tcPr>
           <w:p>
             <w:r/>
@@ -1727,7 +1727,7 @@
         <w:tc>
           <w:tcPr>
             <w:tcW w:type="dxa" w:w="7143"/>
-            <w:shd w:val="clear" w:color="auto" w:fill="DBEAFE"/>
+            <w:shd w:val="clear" w:color="auto" w:fill="E5E5E5"/>
           </w:tcPr>
           <w:p>
             <w:r/>
@@ -2602,7 +2602,7 @@
         <w:tc>
           <w:tcPr>
             <w:tcW w:type="dxa" w:w="2268"/>
-            <w:shd w:val="clear" w:color="auto" w:fill="DBEAFE"/>
+            <w:shd w:val="clear" w:color="auto" w:fill="E5E5E5"/>
           </w:tcPr>
           <w:p>
             <w:r/>
@@ -2618,7 +2618,7 @@
         <w:tc>
           <w:tcPr>
             <w:tcW w:type="dxa" w:w="7143"/>
-            <w:shd w:val="clear" w:color="auto" w:fill="DBEAFE"/>
+            <w:shd w:val="clear" w:color="auto" w:fill="E5E5E5"/>
           </w:tcPr>
           <w:p>
             <w:r/>
@@ -3480,7 +3480,7 @@
         <w:tc>
           <w:tcPr>
             <w:tcW w:type="dxa" w:w="2835"/>
-            <w:shd w:val="clear" w:color="auto" w:fill="DBEAFE"/>
+            <w:shd w:val="clear" w:color="auto" w:fill="E5E5E5"/>
           </w:tcPr>
           <w:p>
             <w:r/>
@@ -3496,7 +3496,7 @@
         <w:tc>
           <w:tcPr>
             <w:tcW w:type="dxa" w:w="6576"/>
-            <w:shd w:val="clear" w:color="auto" w:fill="DBEAFE"/>
+            <w:shd w:val="clear" w:color="auto" w:fill="E5E5E5"/>
           </w:tcPr>
           <w:p>
             <w:r/>
@@ -3761,7 +3761,7 @@
         <w:tc>
           <w:tcPr>
             <w:tcW w:type="dxa" w:w="4535"/>
-            <w:shd w:val="clear" w:color="auto" w:fill="DBEAFE"/>
+            <w:shd w:val="clear" w:color="auto" w:fill="E5E5E5"/>
           </w:tcPr>
           <w:p>
             <w:r/>
@@ -3777,7 +3777,7 @@
         <w:tc>
           <w:tcPr>
             <w:tcW w:type="dxa" w:w="4876"/>
-            <w:shd w:val="clear" w:color="auto" w:fill="DBEAFE"/>
+            <w:shd w:val="clear" w:color="auto" w:fill="E5E5E5"/>
           </w:tcPr>
           <w:p>
             <w:r/>
@@ -4510,7 +4510,7 @@
         <w:tc>
           <w:tcPr>
             <w:tcW w:type="dxa" w:w="9411"/>
-            <w:shd w:val="clear" w:color="auto" w:fill="EFF6FF"/>
+            <w:shd w:val="clear" w:color="auto" w:fill="F2F2F2"/>
           </w:tcPr>
           <w:p>
             <w:r/>
@@ -4570,7 +4570,7 @@
         <w:tc>
           <w:tcPr>
             <w:tcW w:type="dxa" w:w="2551"/>
-            <w:shd w:val="clear" w:color="auto" w:fill="DBEAFE"/>
+            <w:shd w:val="clear" w:color="auto" w:fill="E5E5E5"/>
           </w:tcPr>
           <w:p>
             <w:r/>
@@ -4586,7 +4586,7 @@
         <w:tc>
           <w:tcPr>
             <w:tcW w:type="dxa" w:w="6860"/>
-            <w:shd w:val="clear" w:color="auto" w:fill="DBEAFE"/>
+            <w:shd w:val="clear" w:color="auto" w:fill="E5E5E5"/>
           </w:tcPr>
           <w:p>
             <w:r/>
@@ -4846,7 +4846,7 @@
       </w:pPr>
       <w:r>
         <w:rPr>
-          <w:color w:val="475569"/>
+          <w:color w:val="4D4D4D"/>
           <w:sz w:val="18"/>
         </w:rPr>
         <w:t>Figure 1 of the paper: the six phases. Grey boxes use the language model.</w:t>
@@ -4877,7 +4877,7 @@
         <w:tc>
           <w:tcPr>
             <w:tcW w:type="dxa" w:w="1474"/>
-            <w:shd w:val="clear" w:color="auto" w:fill="DBEAFE"/>
+            <w:shd w:val="clear" w:color="auto" w:fill="E5E5E5"/>
           </w:tcPr>
           <w:p>
             <w:r/>
@@ -4893,7 +4893,7 @@
         <w:tc>
           <w:tcPr>
             <w:tcW w:type="dxa" w:w="1474"/>
-            <w:shd w:val="clear" w:color="auto" w:fill="DBEAFE"/>
+            <w:shd w:val="clear" w:color="auto" w:fill="E5E5E5"/>
           </w:tcPr>
           <w:p>
             <w:r/>
@@ -4909,7 +4909,7 @@
         <w:tc>
           <w:tcPr>
             <w:tcW w:type="dxa" w:w="3628"/>
-            <w:shd w:val="clear" w:color="auto" w:fill="DBEAFE"/>
+            <w:shd w:val="clear" w:color="auto" w:fill="E5E5E5"/>
           </w:tcPr>
           <w:p>
             <w:r/>
@@ -4925,7 +4925,7 @@
         <w:tc>
           <w:tcPr>
             <w:tcW w:type="dxa" w:w="2835"/>
-            <w:shd w:val="clear" w:color="auto" w:fill="DBEAFE"/>
+            <w:shd w:val="clear" w:color="auto" w:fill="E5E5E5"/>
           </w:tcPr>
           <w:p>
             <w:r/>
@@ -5646,7 +5646,7 @@
         <w:tc>
           <w:tcPr>
             <w:tcW w:type="dxa" w:w="1474"/>
-            <w:shd w:val="clear" w:color="auto" w:fill="DBEAFE"/>
+            <w:shd w:val="clear" w:color="auto" w:fill="E5E5E5"/>
           </w:tcPr>
           <w:p>
             <w:r/>
@@ -5662,7 +5662,7 @@
         <w:tc>
           <w:tcPr>
             <w:tcW w:type="dxa" w:w="6236"/>
-            <w:shd w:val="clear" w:color="auto" w:fill="DBEAFE"/>
+            <w:shd w:val="clear" w:color="auto" w:fill="E5E5E5"/>
           </w:tcPr>
           <w:p>
             <w:r/>
@@ -5678,7 +5678,7 @@
         <w:tc>
           <w:tcPr>
             <w:tcW w:type="dxa" w:w="1701"/>
-            <w:shd w:val="clear" w:color="auto" w:fill="DBEAFE"/>
+            <w:shd w:val="clear" w:color="auto" w:fill="E5E5E5"/>
           </w:tcPr>
           <w:p>
             <w:r/>
@@ -6015,7 +6015,7 @@
         <w:tc>
           <w:tcPr>
             <w:tcW w:type="dxa" w:w="9411"/>
-            <w:shd w:val="clear" w:color="auto" w:fill="EFF6FF"/>
+            <w:shd w:val="clear" w:color="auto" w:fill="F2F2F2"/>
           </w:tcPr>
           <w:p>
             <w:r/>
@@ -6129,7 +6129,7 @@
         <w:tc>
           <w:tcPr>
             <w:tcW w:type="dxa" w:w="9411"/>
-            <w:shd w:val="clear" w:color="auto" w:fill="EFF6FF"/>
+            <w:shd w:val="clear" w:color="auto" w:fill="F2F2F2"/>
           </w:tcPr>
           <w:p>
             <w:r/>
@@ -6176,7 +6176,7 @@
         <w:tc>
           <w:tcPr>
             <w:tcW w:type="dxa" w:w="9411"/>
-            <w:shd w:val="clear" w:color="auto" w:fill="EFF6FF"/>
+            <w:shd w:val="clear" w:color="auto" w:fill="F2F2F2"/>
           </w:tcPr>
           <w:p>
             <w:r/>
@@ -6259,7 +6259,7 @@
         <w:tc>
           <w:tcPr>
             <w:tcW w:type="dxa" w:w="9411"/>
-            <w:shd w:val="clear" w:color="auto" w:fill="EFF6FF"/>
+            <w:shd w:val="clear" w:color="auto" w:fill="F2F2F2"/>
           </w:tcPr>
           <w:p>
             <w:r/>
@@ -6371,7 +6371,7 @@
         <w:tc>
           <w:tcPr>
             <w:tcW w:type="dxa" w:w="2268"/>
-            <w:shd w:val="clear" w:color="auto" w:fill="DBEAFE"/>
+            <w:shd w:val="clear" w:color="auto" w:fill="E5E5E5"/>
           </w:tcPr>
           <w:p>
             <w:r/>
@@ -6387,7 +6387,7 @@
         <w:tc>
           <w:tcPr>
             <w:tcW w:type="dxa" w:w="2041"/>
-            <w:shd w:val="clear" w:color="auto" w:fill="DBEAFE"/>
+            <w:shd w:val="clear" w:color="auto" w:fill="E5E5E5"/>
           </w:tcPr>
           <w:p>
             <w:r/>
@@ -6403,7 +6403,7 @@
         <w:tc>
           <w:tcPr>
             <w:tcW w:type="dxa" w:w="907"/>
-            <w:shd w:val="clear" w:color="auto" w:fill="DBEAFE"/>
+            <w:shd w:val="clear" w:color="auto" w:fill="E5E5E5"/>
           </w:tcPr>
           <w:p>
             <w:r/>
@@ -6419,7 +6419,7 @@
         <w:tc>
           <w:tcPr>
             <w:tcW w:type="dxa" w:w="1134"/>
-            <w:shd w:val="clear" w:color="auto" w:fill="DBEAFE"/>
+            <w:shd w:val="clear" w:color="auto" w:fill="E5E5E5"/>
           </w:tcPr>
           <w:p>
             <w:r/>
@@ -6435,7 +6435,7 @@
         <w:tc>
           <w:tcPr>
             <w:tcW w:type="dxa" w:w="794"/>
-            <w:shd w:val="clear" w:color="auto" w:fill="DBEAFE"/>
+            <w:shd w:val="clear" w:color="auto" w:fill="E5E5E5"/>
           </w:tcPr>
           <w:p>
             <w:r/>
@@ -6451,7 +6451,7 @@
         <w:tc>
           <w:tcPr>
             <w:tcW w:type="dxa" w:w="2268"/>
-            <w:shd w:val="clear" w:color="auto" w:fill="DBEAFE"/>
+            <w:shd w:val="clear" w:color="auto" w:fill="E5E5E5"/>
           </w:tcPr>
           <w:p>
             <w:r/>
@@ -6802,7 +6802,7 @@
         <w:tc>
           <w:tcPr>
             <w:tcW w:type="dxa" w:w="1134"/>
-            <w:shd w:val="clear" w:color="auto" w:fill="DBEAFE"/>
+            <w:shd w:val="clear" w:color="auto" w:fill="E5E5E5"/>
           </w:tcPr>
           <w:p>
             <w:r/>
@@ -6818,7 +6818,7 @@
         <w:tc>
           <w:tcPr>
             <w:tcW w:type="dxa" w:w="5102"/>
-            <w:shd w:val="clear" w:color="auto" w:fill="DBEAFE"/>
+            <w:shd w:val="clear" w:color="auto" w:fill="E5E5E5"/>
           </w:tcPr>
           <w:p>
             <w:r/>
@@ -6834,7 +6834,7 @@
         <w:tc>
           <w:tcPr>
             <w:tcW w:type="dxa" w:w="3175"/>
-            <w:shd w:val="clear" w:color="auto" w:fill="DBEAFE"/>
+            <w:shd w:val="clear" w:color="auto" w:fill="E5E5E5"/>
           </w:tcPr>
           <w:p>
             <w:r/>
@@ -7325,7 +7325,7 @@
         <w:tc>
           <w:tcPr>
             <w:tcW w:type="dxa" w:w="964"/>
-            <w:shd w:val="clear" w:color="auto" w:fill="DBEAFE"/>
+            <w:shd w:val="clear" w:color="auto" w:fill="E5E5E5"/>
           </w:tcPr>
           <w:p>
             <w:r/>
@@ -7341,7 +7341,7 @@
         <w:tc>
           <w:tcPr>
             <w:tcW w:type="dxa" w:w="1871"/>
-            <w:shd w:val="clear" w:color="auto" w:fill="DBEAFE"/>
+            <w:shd w:val="clear" w:color="auto" w:fill="E5E5E5"/>
           </w:tcPr>
           <w:p>
             <w:r/>
@@ -7357,7 +7357,7 @@
         <w:tc>
           <w:tcPr>
             <w:tcW w:type="dxa" w:w="1871"/>
-            <w:shd w:val="clear" w:color="auto" w:fill="DBEAFE"/>
+            <w:shd w:val="clear" w:color="auto" w:fill="E5E5E5"/>
           </w:tcPr>
           <w:p>
             <w:r/>
@@ -7373,7 +7373,7 @@
         <w:tc>
           <w:tcPr>
             <w:tcW w:type="dxa" w:w="1871"/>
-            <w:shd w:val="clear" w:color="auto" w:fill="DBEAFE"/>
+            <w:shd w:val="clear" w:color="auto" w:fill="E5E5E5"/>
           </w:tcPr>
           <w:p>
             <w:r/>
@@ -7389,7 +7389,7 @@
         <w:tc>
           <w:tcPr>
             <w:tcW w:type="dxa" w:w="2835"/>
-            <w:shd w:val="clear" w:color="auto" w:fill="DBEAFE"/>
+            <w:shd w:val="clear" w:color="auto" w:fill="E5E5E5"/>
           </w:tcPr>
           <w:p>
             <w:r/>
@@ -8038,7 +8038,7 @@
       </w:pPr>
       <w:r>
         <w:rPr>
-          <w:color w:val="475569"/>
+          <w:color w:val="4D4D4D"/>
           <w:sz w:val="18"/>
         </w:rPr>
         <w:t>Figure 2 of the paper: test intent macro-F1 for each system and project. Each bar pattern is one system. The gap on P3 is B2, which was not run there.</w:t>
@@ -8069,7 +8069,7 @@
         <w:tc>
           <w:tcPr>
             <w:tcW w:type="dxa" w:w="2835"/>
-            <w:shd w:val="clear" w:color="auto" w:fill="DBEAFE"/>
+            <w:shd w:val="clear" w:color="auto" w:fill="E5E5E5"/>
           </w:tcPr>
           <w:p>
             <w:r/>
@@ -8084,7 +8084,7 @@
         <w:tc>
           <w:tcPr>
             <w:tcW w:type="dxa" w:w="2154"/>
-            <w:shd w:val="clear" w:color="auto" w:fill="DBEAFE"/>
+            <w:shd w:val="clear" w:color="auto" w:fill="E5E5E5"/>
           </w:tcPr>
           <w:p>
             <w:r/>
@@ -8100,7 +8100,7 @@
         <w:tc>
           <w:tcPr>
             <w:tcW w:type="dxa" w:w="2154"/>
-            <w:shd w:val="clear" w:color="auto" w:fill="DBEAFE"/>
+            <w:shd w:val="clear" w:color="auto" w:fill="E5E5E5"/>
           </w:tcPr>
           <w:p>
             <w:r/>
@@ -8116,7 +8116,7 @@
         <w:tc>
           <w:tcPr>
             <w:tcW w:type="dxa" w:w="2268"/>
-            <w:shd w:val="clear" w:color="auto" w:fill="DBEAFE"/>
+            <w:shd w:val="clear" w:color="auto" w:fill="E5E5E5"/>
           </w:tcPr>
           <w:p>
             <w:r/>
@@ -8307,7 +8307,7 @@
       </w:pPr>
       <w:r>
         <w:rPr>
-          <w:color w:val="475569"/>
+          <w:color w:val="4D4D4D"/>
           <w:sz w:val="18"/>
         </w:rPr>
         <w:t>Figure 3 of the paper: each line is a 95% confidence interval of a difference in intent F1, in points. The dot is the measured difference. Filled square = the line does not cross the dashed zero line, so the difference is significant.</w:t>
@@ -8401,7 +8401,7 @@
         <w:tc>
           <w:tcPr>
             <w:tcW w:type="dxa" w:w="1474"/>
-            <w:shd w:val="clear" w:color="auto" w:fill="DBEAFE"/>
+            <w:shd w:val="clear" w:color="auto" w:fill="E5E5E5"/>
           </w:tcPr>
           <w:p>
             <w:r/>
@@ -8417,7 +8417,7 @@
         <w:tc>
           <w:tcPr>
             <w:tcW w:type="dxa" w:w="2835"/>
-            <w:shd w:val="clear" w:color="auto" w:fill="DBEAFE"/>
+            <w:shd w:val="clear" w:color="auto" w:fill="E5E5E5"/>
           </w:tcPr>
           <w:p>
             <w:r/>
@@ -8433,7 +8433,7 @@
         <w:tc>
           <w:tcPr>
             <w:tcW w:type="dxa" w:w="2551"/>
-            <w:shd w:val="clear" w:color="auto" w:fill="DBEAFE"/>
+            <w:shd w:val="clear" w:color="auto" w:fill="E5E5E5"/>
           </w:tcPr>
           <w:p>
             <w:r/>
@@ -8449,7 +8449,7 @@
         <w:tc>
           <w:tcPr>
             <w:tcW w:type="dxa" w:w="2551"/>
-            <w:shd w:val="clear" w:color="auto" w:fill="DBEAFE"/>
+            <w:shd w:val="clear" w:color="auto" w:fill="E5E5E5"/>
           </w:tcPr>
           <w:p>
             <w:r/>
@@ -8758,7 +8758,7 @@
         <w:tc>
           <w:tcPr>
             <w:tcW w:type="dxa" w:w="2494"/>
-            <w:shd w:val="clear" w:color="auto" w:fill="DBEAFE"/>
+            <w:shd w:val="clear" w:color="auto" w:fill="E5E5E5"/>
           </w:tcPr>
           <w:p>
             <w:r/>
@@ -8774,7 +8774,7 @@
         <w:tc>
           <w:tcPr>
             <w:tcW w:type="dxa" w:w="737"/>
-            <w:shd w:val="clear" w:color="auto" w:fill="DBEAFE"/>
+            <w:shd w:val="clear" w:color="auto" w:fill="E5E5E5"/>
           </w:tcPr>
           <w:p>
             <w:r/>
@@ -8790,7 +8790,7 @@
         <w:tc>
           <w:tcPr>
             <w:tcW w:type="dxa" w:w="737"/>
-            <w:shd w:val="clear" w:color="auto" w:fill="DBEAFE"/>
+            <w:shd w:val="clear" w:color="auto" w:fill="E5E5E5"/>
           </w:tcPr>
           <w:p>
             <w:r/>
@@ -8806,7 +8806,7 @@
         <w:tc>
           <w:tcPr>
             <w:tcW w:type="dxa" w:w="737"/>
-            <w:shd w:val="clear" w:color="auto" w:fill="DBEAFE"/>
+            <w:shd w:val="clear" w:color="auto" w:fill="E5E5E5"/>
           </w:tcPr>
           <w:p>
             <w:r/>
@@ -8822,7 +8822,7 @@
         <w:tc>
           <w:tcPr>
             <w:tcW w:type="dxa" w:w="4706"/>
-            <w:shd w:val="clear" w:color="auto" w:fill="DBEAFE"/>
+            <w:shd w:val="clear" w:color="auto" w:fill="E5E5E5"/>
           </w:tcPr>
           <w:p>
             <w:r/>
@@ -9302,7 +9302,7 @@
         <w:tc>
           <w:tcPr>
             <w:tcW w:type="dxa" w:w="454"/>
-            <w:shd w:val="clear" w:color="auto" w:fill="DBEAFE"/>
+            <w:shd w:val="clear" w:color="auto" w:fill="E5E5E5"/>
           </w:tcPr>
           <w:p>
             <w:r/>
@@ -9318,7 +9318,7 @@
         <w:tc>
           <w:tcPr>
             <w:tcW w:type="dxa" w:w="4535"/>
-            <w:shd w:val="clear" w:color="auto" w:fill="DBEAFE"/>
+            <w:shd w:val="clear" w:color="auto" w:fill="E5E5E5"/>
           </w:tcPr>
           <w:p>
             <w:r/>
@@ -9334,7 +9334,7 @@
         <w:tc>
           <w:tcPr>
             <w:tcW w:type="dxa" w:w="4422"/>
-            <w:shd w:val="clear" w:color="auto" w:fill="DBEAFE"/>
+            <w:shd w:val="clear" w:color="auto" w:fill="E5E5E5"/>
           </w:tcPr>
           <w:p>
             <w:r/>
@@ -10185,7 +10185,7 @@
         <w:tc>
           <w:tcPr>
             <w:tcW w:type="dxa" w:w="3685"/>
-            <w:shd w:val="clear" w:color="auto" w:fill="DBEAFE"/>
+            <w:shd w:val="clear" w:color="auto" w:fill="E5E5E5"/>
           </w:tcPr>
           <w:p>
             <w:r/>
@@ -10201,7 +10201,7 @@
         <w:tc>
           <w:tcPr>
             <w:tcW w:type="dxa" w:w="5726"/>
-            <w:shd w:val="clear" w:color="auto" w:fill="DBEAFE"/>
+            <w:shd w:val="clear" w:color="auto" w:fill="E5E5E5"/>
           </w:tcPr>
           <w:p>
             <w:r/>
@@ -11343,7 +11343,7 @@
       <w:rFonts w:asciiTheme="majorHAnsi" w:eastAsiaTheme="majorEastAsia" w:hAnsiTheme="majorHAnsi" w:cstheme="majorBidi" w:ascii="Calibri" w:hAnsi="Calibri"/>
       <w:b/>
       <w:bCs/>
-      <w:color w:val="1D4ED8"/>
+      <w:color w:val="000000"/>
       <w:sz w:val="36"/>
       <w:szCs w:val="28"/>
     </w:rPr>
@@ -11367,7 +11367,7 @@
       <w:rFonts w:asciiTheme="majorHAnsi" w:eastAsiaTheme="majorEastAsia" w:hAnsiTheme="majorHAnsi" w:cstheme="majorBidi" w:ascii="Calibri" w:hAnsi="Calibri"/>
       <w:b/>
       <w:bCs/>
-      <w:color w:val="1D4ED8"/>
+      <w:color w:val="000000"/>
       <w:sz w:val="28"/>
       <w:szCs w:val="26"/>
     </w:rPr>
@@ -11391,7 +11391,7 @@
       <w:rFonts w:asciiTheme="majorHAnsi" w:eastAsiaTheme="majorEastAsia" w:hAnsiTheme="majorHAnsi" w:cstheme="majorBidi" w:ascii="Calibri" w:hAnsi="Calibri"/>
       <w:b/>
       <w:bCs/>
-      <w:color w:val="1E293B"/>
+      <w:color w:val="1A1A1A"/>
       <w:sz w:val="24"/>
     </w:rPr>
   </w:style>

</xml_diff>